<commit_message>
Adding ai features and tools
</commit_message>
<xml_diff>
--- a/docs/Template pj's.docx
+++ b/docs/Template pj's.docx
@@ -2019,6 +2019,88 @@
         <w:t xml:space="preserve">[Reputation, allies, enemies, hooks, secrets, current status, and campaign-facing prompts.]</w:t>
       </w:r>
     </w:p>
+    <w:p>
+      <w:r>
+        <w:t xml:space="preserve">AI Assets</w:t>
+      </w:r>
+    </w:p>
+    <w:tbl>
+      <w:tblPr>
+        <w:tblW w:w="0" w:type="auto"/>
+        <w:tblBorders>
+          <w:top w:val="single" w:sz="4"/>
+          <w:left w:val="single" w:sz="4"/>
+          <w:bottom w:val="single" w:sz="4"/>
+          <w:right w:val="single" w:sz="4"/>
+          <w:insideH w:val="single" w:sz="4"/>
+          <w:insideV w:val="single" w:sz="4"/>
+        </w:tblBorders>
+      </w:tblPr>
+      <w:tr>
+        <w:tc>
+          <w:p>
+            <w:r>
+              <w:t xml:space="preserve">Field</w:t>
+            </w:r>
+          </w:p>
+        </w:tc>
+        <w:tc>
+          <w:p>
+            <w:r>
+              <w:t xml:space="preserve">Value</w:t>
+            </w:r>
+          </w:p>
+        </w:tc>
+      </w:tr>
+      <w:tr>
+        <w:tc>
+          <w:p>
+            <w:r>
+              <w:t xml:space="preserve">run_ai</w:t>
+            </w:r>
+          </w:p>
+        </w:tc>
+        <w:tc>
+          <w:p>
+            <w:r>
+              <w:t xml:space="preserve">false</w:t>
+            </w:r>
+          </w:p>
+        </w:tc>
+      </w:tr>
+      <w:tr>
+        <w:tc>
+          <w:p>
+            <w:r>
+              <w:t xml:space="preserve">provider</w:t>
+            </w:r>
+          </w:p>
+        </w:tc>
+        <w:tc>
+          <w:p>
+            <w:r>
+              <w:t xml:space="preserve">mock</w:t>
+            </w:r>
+          </w:p>
+        </w:tc>
+      </w:tr>
+      <w:tr>
+        <w:tc>
+          <w:p>
+            <w:r>
+              <w:t xml:space="preserve">force</w:t>
+            </w:r>
+          </w:p>
+        </w:tc>
+        <w:tc>
+          <w:p>
+            <w:r>
+              <w:t xml:space="preserve">false</w:t>
+            </w:r>
+          </w:p>
+        </w:tc>
+      </w:tr>
+    </w:tbl>
     <w:p>
       <w:r>
         <w:t xml:space="preserve">Sources</w:t>

</xml_diff>

<commit_message>
Updating the ai intergration
</commit_message>
<xml_diff>
--- a/docs/Template pj's.docx
+++ b/docs/Template pj's.docx
@@ -2080,6 +2080,120 @@
           <w:p>
             <w:r>
               <w:t xml:space="preserve">mock</w:t>
+            </w:r>
+          </w:p>
+        </w:tc>
+      </w:tr>
+      <w:tr>
+        <w:tc>
+          <w:p>
+            <w:r>
+              <w:t xml:space="preserve">force</w:t>
+            </w:r>
+          </w:p>
+        </w:tc>
+        <w:tc>
+          <w:p>
+            <w:r>
+              <w:t xml:space="preserve">false</w:t>
+            </w:r>
+          </w:p>
+        </w:tc>
+      </w:tr>
+    </w:tbl>
+    <w:p>
+      <w:r>
+        <w:t xml:space="preserve">3D Assets</w:t>
+      </w:r>
+    </w:p>
+    <w:tbl>
+      <w:tblPr>
+        <w:tblW w:w="0" w:type="auto"/>
+        <w:tblBorders>
+          <w:top w:val="single" w:sz="4"/>
+          <w:left w:val="single" w:sz="4"/>
+          <w:bottom w:val="single" w:sz="4"/>
+          <w:right w:val="single" w:sz="4"/>
+          <w:insideH w:val="single" w:sz="4"/>
+          <w:insideV w:val="single" w:sz="4"/>
+        </w:tblBorders>
+      </w:tblPr>
+      <w:tr>
+        <w:tc>
+          <w:p>
+            <w:r>
+              <w:t xml:space="preserve">Field</w:t>
+            </w:r>
+          </w:p>
+        </w:tc>
+        <w:tc>
+          <w:p>
+            <w:r>
+              <w:t xml:space="preserve">Value</w:t>
+            </w:r>
+          </w:p>
+        </w:tc>
+      </w:tr>
+      <w:tr>
+        <w:tc>
+          <w:p>
+            <w:r>
+              <w:t xml:space="preserve">stl</w:t>
+            </w:r>
+          </w:p>
+        </w:tc>
+        <w:tc>
+          <w:p>
+            <w:r>
+              <w:t xml:space="preserve"/>
+            </w:r>
+          </w:p>
+        </w:tc>
+      </w:tr>
+      <w:tr>
+        <w:tc>
+          <w:p>
+            <w:r>
+              <w:t xml:space="preserve">run_3d</w:t>
+            </w:r>
+          </w:p>
+        </w:tc>
+        <w:tc>
+          <w:p>
+            <w:r>
+              <w:t xml:space="preserve">false</w:t>
+            </w:r>
+          </w:p>
+        </w:tc>
+      </w:tr>
+      <w:tr>
+        <w:tc>
+          <w:p>
+            <w:r>
+              <w:t xml:space="preserve">provider</w:t>
+            </w:r>
+          </w:p>
+        </w:tc>
+        <w:tc>
+          <w:p>
+            <w:r>
+              <w:t xml:space="preserve">mock</w:t>
+            </w:r>
+          </w:p>
+        </w:tc>
+      </w:tr>
+      <w:tr>
+        <w:tc>
+          <w:p>
+            <w:r>
+              <w:t xml:space="preserve">input</w:t>
+            </w:r>
+          </w:p>
+        </w:tc>
+        <w:tc>
+          <w:p>
+            <w:r>
+              <w:t xml:space="preserve">text</w:t>
             </w:r>
           </w:p>
         </w:tc>

</xml_diff>